<commit_message>
new spilt & resAdded train
</commit_message>
<xml_diff>
--- a/z reports/CHY report w6 - prof, err, quan, purn.docx
+++ b/z reports/CHY report w6 - prof, err, quan, purn.docx
@@ -11,7 +11,29 @@
       </w:r>
     </w:p>
     <w:p>
+      <w:pPr>
+        <w:rPr>
+          <w:b/>
+          <w:bCs/>
+          <w:sz w:val="36"/>
+          <w:szCs w:val="32"/>
+        </w:rPr>
+      </w:pPr>
       <w:r>
+        <w:rPr>
+          <w:b/>
+          <w:bCs/>
+          <w:sz w:val="36"/>
+          <w:szCs w:val="32"/>
+        </w:rPr>
+        <w:t>Training</w:t>
+      </w:r>
+    </w:p>
+    <w:p>
+      <w:r>
+        <w:rPr>
+          <w:noProof/>
+        </w:rPr>
         <w:drawing>
           <wp:inline distT="0" distB="0" distL="0" distR="0" wp14:anchorId="3695F922" wp14:editId="5987C08B">
             <wp:extent cx="6479540" cy="415290"/>
@@ -50,10 +72,487 @@
       </w:r>
     </w:p>
     <w:p/>
+    <w:p>
+      <w:r>
+        <w:drawing>
+          <wp:inline distT="0" distB="0" distL="0" distR="0" wp14:anchorId="6E4B44A5" wp14:editId="7E23002E">
+            <wp:extent cx="6479540" cy="2887345"/>
+            <wp:effectExtent l="0" t="0" r="0" b="8255"/>
+            <wp:docPr id="1147178812" name="Picture 1"/>
+            <wp:cNvGraphicFramePr>
+              <a:graphicFrameLocks xmlns:a="http://schemas.openxmlformats.org/drawingml/2006/main" noChangeAspect="1"/>
+            </wp:cNvGraphicFramePr>
+            <a:graphic xmlns:a="http://schemas.openxmlformats.org/drawingml/2006/main">
+              <a:graphicData uri="http://schemas.openxmlformats.org/drawingml/2006/picture">
+                <pic:pic xmlns:pic="http://schemas.openxmlformats.org/drawingml/2006/picture">
+                  <pic:nvPicPr>
+                    <pic:cNvPr id="1147178812" name=""/>
+                    <pic:cNvPicPr/>
+                  </pic:nvPicPr>
+                  <pic:blipFill>
+                    <a:blip r:embed="rId8"/>
+                    <a:stretch>
+                      <a:fillRect/>
+                    </a:stretch>
+                  </pic:blipFill>
+                  <pic:spPr>
+                    <a:xfrm>
+                      <a:off x="0" y="0"/>
+                      <a:ext cx="6479540" cy="2887345"/>
+                    </a:xfrm>
+                    <a:prstGeom prst="rect">
+                      <a:avLst/>
+                    </a:prstGeom>
+                  </pic:spPr>
+                </pic:pic>
+              </a:graphicData>
+            </a:graphic>
+          </wp:inline>
+        </w:drawing>
+      </w:r>
+    </w:p>
+    <w:p>
+      <w:r>
+        <w:drawing>
+          <wp:inline distT="0" distB="0" distL="0" distR="0" wp14:anchorId="70BD6302" wp14:editId="4298EE24">
+            <wp:extent cx="6479540" cy="2897505"/>
+            <wp:effectExtent l="0" t="0" r="0" b="0"/>
+            <wp:docPr id="705657133" name="Picture 1"/>
+            <wp:cNvGraphicFramePr>
+              <a:graphicFrameLocks xmlns:a="http://schemas.openxmlformats.org/drawingml/2006/main" noChangeAspect="1"/>
+            </wp:cNvGraphicFramePr>
+            <a:graphic xmlns:a="http://schemas.openxmlformats.org/drawingml/2006/main">
+              <a:graphicData uri="http://schemas.openxmlformats.org/drawingml/2006/picture">
+                <pic:pic xmlns:pic="http://schemas.openxmlformats.org/drawingml/2006/picture">
+                  <pic:nvPicPr>
+                    <pic:cNvPr id="705657133" name=""/>
+                    <pic:cNvPicPr/>
+                  </pic:nvPicPr>
+                  <pic:blipFill>
+                    <a:blip r:embed="rId9"/>
+                    <a:stretch>
+                      <a:fillRect/>
+                    </a:stretch>
+                  </pic:blipFill>
+                  <pic:spPr>
+                    <a:xfrm>
+                      <a:off x="0" y="0"/>
+                      <a:ext cx="6479540" cy="2897505"/>
+                    </a:xfrm>
+                    <a:prstGeom prst="rect">
+                      <a:avLst/>
+                    </a:prstGeom>
+                  </pic:spPr>
+                </pic:pic>
+              </a:graphicData>
+            </a:graphic>
+          </wp:inline>
+        </w:drawing>
+      </w:r>
+    </w:p>
+    <w:p/>
+    <w:p>
+      <w:r>
+        <w:lastRenderedPageBreak/>
+        <w:drawing>
+          <wp:inline distT="0" distB="0" distL="0" distR="0" wp14:anchorId="5AC34095" wp14:editId="2099856C">
+            <wp:extent cx="6479540" cy="2730500"/>
+            <wp:effectExtent l="0" t="0" r="0" b="0"/>
+            <wp:docPr id="1560831187" name="Picture 1"/>
+            <wp:cNvGraphicFramePr>
+              <a:graphicFrameLocks xmlns:a="http://schemas.openxmlformats.org/drawingml/2006/main" noChangeAspect="1"/>
+            </wp:cNvGraphicFramePr>
+            <a:graphic xmlns:a="http://schemas.openxmlformats.org/drawingml/2006/main">
+              <a:graphicData uri="http://schemas.openxmlformats.org/drawingml/2006/picture">
+                <pic:pic xmlns:pic="http://schemas.openxmlformats.org/drawingml/2006/picture">
+                  <pic:nvPicPr>
+                    <pic:cNvPr id="1560831187" name=""/>
+                    <pic:cNvPicPr/>
+                  </pic:nvPicPr>
+                  <pic:blipFill>
+                    <a:blip r:embed="rId10"/>
+                    <a:stretch>
+                      <a:fillRect/>
+                    </a:stretch>
+                  </pic:blipFill>
+                  <pic:spPr>
+                    <a:xfrm>
+                      <a:off x="0" y="0"/>
+                      <a:ext cx="6479540" cy="2730500"/>
+                    </a:xfrm>
+                    <a:prstGeom prst="rect">
+                      <a:avLst/>
+                    </a:prstGeom>
+                  </pic:spPr>
+                </pic:pic>
+              </a:graphicData>
+            </a:graphic>
+          </wp:inline>
+        </w:drawing>
+      </w:r>
+    </w:p>
+    <w:p/>
+    <w:p>
+      <w:r>
+        <w:drawing>
+          <wp:inline distT="0" distB="0" distL="0" distR="0" wp14:anchorId="2A77DD1C" wp14:editId="181CFF58">
+            <wp:extent cx="6479540" cy="3735705"/>
+            <wp:effectExtent l="0" t="0" r="0" b="0"/>
+            <wp:docPr id="2029215401" name="Picture 1"/>
+            <wp:cNvGraphicFramePr>
+              <a:graphicFrameLocks xmlns:a="http://schemas.openxmlformats.org/drawingml/2006/main" noChangeAspect="1"/>
+            </wp:cNvGraphicFramePr>
+            <a:graphic xmlns:a="http://schemas.openxmlformats.org/drawingml/2006/main">
+              <a:graphicData uri="http://schemas.openxmlformats.org/drawingml/2006/picture">
+                <pic:pic xmlns:pic="http://schemas.openxmlformats.org/drawingml/2006/picture">
+                  <pic:nvPicPr>
+                    <pic:cNvPr id="2029215401" name=""/>
+                    <pic:cNvPicPr/>
+                  </pic:nvPicPr>
+                  <pic:blipFill>
+                    <a:blip r:embed="rId11"/>
+                    <a:stretch>
+                      <a:fillRect/>
+                    </a:stretch>
+                  </pic:blipFill>
+                  <pic:spPr>
+                    <a:xfrm>
+                      <a:off x="0" y="0"/>
+                      <a:ext cx="6479540" cy="3735705"/>
+                    </a:xfrm>
+                    <a:prstGeom prst="rect">
+                      <a:avLst/>
+                    </a:prstGeom>
+                  </pic:spPr>
+                </pic:pic>
+              </a:graphicData>
+            </a:graphic>
+          </wp:inline>
+        </w:drawing>
+      </w:r>
+    </w:p>
+    <w:p/>
+    <w:p>
+      <w:pPr>
+        <w:rPr>
+          <w:b/>
+          <w:bCs/>
+          <w:sz w:val="36"/>
+          <w:szCs w:val="32"/>
+        </w:rPr>
+      </w:pPr>
+      <w:r>
+        <w:rPr>
+          <w:b/>
+          <w:bCs/>
+          <w:sz w:val="36"/>
+          <w:szCs w:val="32"/>
+        </w:rPr>
+        <w:t>Profiling end-to-end</w:t>
+      </w:r>
+    </w:p>
+    <w:p>
+      <w:r>
+        <w:drawing>
+          <wp:inline distT="0" distB="0" distL="0" distR="0" wp14:anchorId="676E329A" wp14:editId="42C2FBBE">
+            <wp:extent cx="6479540" cy="1226185"/>
+            <wp:effectExtent l="0" t="0" r="0" b="0"/>
+            <wp:docPr id="232814353" name="Picture 1"/>
+            <wp:cNvGraphicFramePr>
+              <a:graphicFrameLocks xmlns:a="http://schemas.openxmlformats.org/drawingml/2006/main" noChangeAspect="1"/>
+            </wp:cNvGraphicFramePr>
+            <a:graphic xmlns:a="http://schemas.openxmlformats.org/drawingml/2006/main">
+              <a:graphicData uri="http://schemas.openxmlformats.org/drawingml/2006/picture">
+                <pic:pic xmlns:pic="http://schemas.openxmlformats.org/drawingml/2006/picture">
+                  <pic:nvPicPr>
+                    <pic:cNvPr id="232814353" name=""/>
+                    <pic:cNvPicPr/>
+                  </pic:nvPicPr>
+                  <pic:blipFill>
+                    <a:blip r:embed="rId12"/>
+                    <a:stretch>
+                      <a:fillRect/>
+                    </a:stretch>
+                  </pic:blipFill>
+                  <pic:spPr>
+                    <a:xfrm>
+                      <a:off x="0" y="0"/>
+                      <a:ext cx="6479540" cy="1226185"/>
+                    </a:xfrm>
+                    <a:prstGeom prst="rect">
+                      <a:avLst/>
+                    </a:prstGeom>
+                  </pic:spPr>
+                </pic:pic>
+              </a:graphicData>
+            </a:graphic>
+          </wp:inline>
+        </w:drawing>
+      </w:r>
+    </w:p>
+    <w:p/>
+    <w:p>
+      <w:r>
+        <w:lastRenderedPageBreak/>
+        <w:drawing>
+          <wp:inline distT="0" distB="0" distL="0" distR="0" wp14:anchorId="5E1FAA89" wp14:editId="772AE4A5">
+            <wp:extent cx="6479540" cy="3651885"/>
+            <wp:effectExtent l="0" t="0" r="0" b="5715"/>
+            <wp:docPr id="1142131723" name="Picture 1"/>
+            <wp:cNvGraphicFramePr>
+              <a:graphicFrameLocks xmlns:a="http://schemas.openxmlformats.org/drawingml/2006/main" noChangeAspect="1"/>
+            </wp:cNvGraphicFramePr>
+            <a:graphic xmlns:a="http://schemas.openxmlformats.org/drawingml/2006/main">
+              <a:graphicData uri="http://schemas.openxmlformats.org/drawingml/2006/picture">
+                <pic:pic xmlns:pic="http://schemas.openxmlformats.org/drawingml/2006/picture">
+                  <pic:nvPicPr>
+                    <pic:cNvPr id="1142131723" name=""/>
+                    <pic:cNvPicPr/>
+                  </pic:nvPicPr>
+                  <pic:blipFill>
+                    <a:blip r:embed="rId13"/>
+                    <a:stretch>
+                      <a:fillRect/>
+                    </a:stretch>
+                  </pic:blipFill>
+                  <pic:spPr>
+                    <a:xfrm>
+                      <a:off x="0" y="0"/>
+                      <a:ext cx="6479540" cy="3651885"/>
+                    </a:xfrm>
+                    <a:prstGeom prst="rect">
+                      <a:avLst/>
+                    </a:prstGeom>
+                  </pic:spPr>
+                </pic:pic>
+              </a:graphicData>
+            </a:graphic>
+          </wp:inline>
+        </w:drawing>
+      </w:r>
+    </w:p>
+    <w:p/>
+    <w:p>
+      <w:pPr>
+        <w:rPr>
+          <w:b/>
+          <w:bCs/>
+          <w:sz w:val="36"/>
+          <w:szCs w:val="32"/>
+        </w:rPr>
+      </w:pPr>
+      <w:r>
+        <w:rPr>
+          <w:b/>
+          <w:bCs/>
+          <w:sz w:val="36"/>
+          <w:szCs w:val="32"/>
+        </w:rPr>
+        <w:t>Profiling layer</w:t>
+      </w:r>
+    </w:p>
+    <w:p>
+      <w:r>
+        <w:drawing>
+          <wp:inline distT="0" distB="0" distL="0" distR="0" wp14:anchorId="21D8B98E" wp14:editId="3A9AC77C">
+            <wp:extent cx="6479540" cy="731520"/>
+            <wp:effectExtent l="0" t="0" r="0" b="0"/>
+            <wp:docPr id="1622497903" name="Picture 1"/>
+            <wp:cNvGraphicFramePr>
+              <a:graphicFrameLocks xmlns:a="http://schemas.openxmlformats.org/drawingml/2006/main" noChangeAspect="1"/>
+            </wp:cNvGraphicFramePr>
+            <a:graphic xmlns:a="http://schemas.openxmlformats.org/drawingml/2006/main">
+              <a:graphicData uri="http://schemas.openxmlformats.org/drawingml/2006/picture">
+                <pic:pic xmlns:pic="http://schemas.openxmlformats.org/drawingml/2006/picture">
+                  <pic:nvPicPr>
+                    <pic:cNvPr id="1622497903" name=""/>
+                    <pic:cNvPicPr/>
+                  </pic:nvPicPr>
+                  <pic:blipFill>
+                    <a:blip r:embed="rId14"/>
+                    <a:stretch>
+                      <a:fillRect/>
+                    </a:stretch>
+                  </pic:blipFill>
+                  <pic:spPr>
+                    <a:xfrm>
+                      <a:off x="0" y="0"/>
+                      <a:ext cx="6479540" cy="731520"/>
+                    </a:xfrm>
+                    <a:prstGeom prst="rect">
+                      <a:avLst/>
+                    </a:prstGeom>
+                  </pic:spPr>
+                </pic:pic>
+              </a:graphicData>
+            </a:graphic>
+          </wp:inline>
+        </w:drawing>
+      </w:r>
+    </w:p>
+    <w:p/>
+    <w:p>
+      <w:pPr>
+        <w:rPr>
+          <w:b/>
+          <w:bCs/>
+          <w:sz w:val="36"/>
+          <w:szCs w:val="32"/>
+        </w:rPr>
+      </w:pPr>
+      <w:r>
+        <w:rPr>
+          <w:b/>
+          <w:bCs/>
+          <w:sz w:val="36"/>
+          <w:szCs w:val="32"/>
+        </w:rPr>
+        <w:t>Error injecting</w:t>
+      </w:r>
+    </w:p>
+    <w:p>
+      <w:r>
+        <w:drawing>
+          <wp:inline distT="0" distB="0" distL="0" distR="0" wp14:anchorId="7A4ACF72" wp14:editId="6394BF42">
+            <wp:extent cx="6479540" cy="452755"/>
+            <wp:effectExtent l="0" t="0" r="0" b="4445"/>
+            <wp:docPr id="519051746" name="Picture 1"/>
+            <wp:cNvGraphicFramePr>
+              <a:graphicFrameLocks xmlns:a="http://schemas.openxmlformats.org/drawingml/2006/main" noChangeAspect="1"/>
+            </wp:cNvGraphicFramePr>
+            <a:graphic xmlns:a="http://schemas.openxmlformats.org/drawingml/2006/main">
+              <a:graphicData uri="http://schemas.openxmlformats.org/drawingml/2006/picture">
+                <pic:pic xmlns:pic="http://schemas.openxmlformats.org/drawingml/2006/picture">
+                  <pic:nvPicPr>
+                    <pic:cNvPr id="519051746" name=""/>
+                    <pic:cNvPicPr/>
+                  </pic:nvPicPr>
+                  <pic:blipFill>
+                    <a:blip r:embed="rId15"/>
+                    <a:stretch>
+                      <a:fillRect/>
+                    </a:stretch>
+                  </pic:blipFill>
+                  <pic:spPr>
+                    <a:xfrm>
+                      <a:off x="0" y="0"/>
+                      <a:ext cx="6479540" cy="452755"/>
+                    </a:xfrm>
+                    <a:prstGeom prst="rect">
+                      <a:avLst/>
+                    </a:prstGeom>
+                  </pic:spPr>
+                </pic:pic>
+              </a:graphicData>
+            </a:graphic>
+          </wp:inline>
+        </w:drawing>
+      </w:r>
+    </w:p>
+    <w:p/>
+    <w:p>
+      <w:r>
+        <w:drawing>
+          <wp:inline distT="0" distB="0" distL="0" distR="0" wp14:anchorId="7C1F1421" wp14:editId="0A40F7A3">
+            <wp:extent cx="6479540" cy="490220"/>
+            <wp:effectExtent l="0" t="0" r="0" b="5080"/>
+            <wp:docPr id="210108416" name="Picture 1"/>
+            <wp:cNvGraphicFramePr>
+              <a:graphicFrameLocks xmlns:a="http://schemas.openxmlformats.org/drawingml/2006/main" noChangeAspect="1"/>
+            </wp:cNvGraphicFramePr>
+            <a:graphic xmlns:a="http://schemas.openxmlformats.org/drawingml/2006/main">
+              <a:graphicData uri="http://schemas.openxmlformats.org/drawingml/2006/picture">
+                <pic:pic xmlns:pic="http://schemas.openxmlformats.org/drawingml/2006/picture">
+                  <pic:nvPicPr>
+                    <pic:cNvPr id="210108416" name=""/>
+                    <pic:cNvPicPr/>
+                  </pic:nvPicPr>
+                  <pic:blipFill>
+                    <a:blip r:embed="rId16"/>
+                    <a:stretch>
+                      <a:fillRect/>
+                    </a:stretch>
+                  </pic:blipFill>
+                  <pic:spPr>
+                    <a:xfrm>
+                      <a:off x="0" y="0"/>
+                      <a:ext cx="6479540" cy="490220"/>
+                    </a:xfrm>
+                    <a:prstGeom prst="rect">
+                      <a:avLst/>
+                    </a:prstGeom>
+                  </pic:spPr>
+                </pic:pic>
+              </a:graphicData>
+            </a:graphic>
+          </wp:inline>
+        </w:drawing>
+      </w:r>
+    </w:p>
     <w:p/>
     <w:p/>
+    <w:p>
+      <w:pPr>
+        <w:rPr>
+          <w:b/>
+          <w:bCs/>
+          <w:sz w:val="36"/>
+          <w:szCs w:val="32"/>
+        </w:rPr>
+      </w:pPr>
+      <w:r>
+        <w:rPr>
+          <w:b/>
+          <w:bCs/>
+          <w:sz w:val="36"/>
+          <w:szCs w:val="32"/>
+        </w:rPr>
+        <w:t>Server Arc solutions</w:t>
+      </w:r>
+    </w:p>
+    <w:p>
+      <w:r>
+        <w:lastRenderedPageBreak/>
+        <w:drawing>
+          <wp:inline distT="0" distB="0" distL="0" distR="0" wp14:anchorId="594D2ADF" wp14:editId="2B7E7477">
+            <wp:extent cx="6479540" cy="2696210"/>
+            <wp:effectExtent l="0" t="0" r="0" b="8890"/>
+            <wp:docPr id="1388979081" name="Picture 1"/>
+            <wp:cNvGraphicFramePr>
+              <a:graphicFrameLocks xmlns:a="http://schemas.openxmlformats.org/drawingml/2006/main" noChangeAspect="1"/>
+            </wp:cNvGraphicFramePr>
+            <a:graphic xmlns:a="http://schemas.openxmlformats.org/drawingml/2006/main">
+              <a:graphicData uri="http://schemas.openxmlformats.org/drawingml/2006/picture">
+                <pic:pic xmlns:pic="http://schemas.openxmlformats.org/drawingml/2006/picture">
+                  <pic:nvPicPr>
+                    <pic:cNvPr id="1388979081" name=""/>
+                    <pic:cNvPicPr/>
+                  </pic:nvPicPr>
+                  <pic:blipFill>
+                    <a:blip r:embed="rId17"/>
+                    <a:stretch>
+                      <a:fillRect/>
+                    </a:stretch>
+                  </pic:blipFill>
+                  <pic:spPr>
+                    <a:xfrm>
+                      <a:off x="0" y="0"/>
+                      <a:ext cx="6479540" cy="2696210"/>
+                    </a:xfrm>
+                    <a:prstGeom prst="rect">
+                      <a:avLst/>
+                    </a:prstGeom>
+                  </pic:spPr>
+                </pic:pic>
+              </a:graphicData>
+            </a:graphic>
+          </wp:inline>
+        </w:drawing>
+      </w:r>
+    </w:p>
+    <w:p/>
     <w:sectPr>
-      <w:footerReference w:type="default" r:id="rId8"/>
+      <w:footerReference w:type="default" r:id="rId18"/>
       <w:pgSz w:w="11906" w:h="16838"/>
       <w:pgMar w:top="1304" w:right="851" w:bottom="1304" w:left="851" w:header="567" w:footer="567" w:gutter="0"/>
       <w:cols w:space="425"/>

</xml_diff>